<commit_message>
Revise opening and Ostrich Eggs; require named mood cards and move photo to lunch
</commit_message>
<xml_diff>
--- a/downloads/activities/ostrich-eggs-instructions.docx
+++ b/downloads/activities/ostrich-eggs-instructions.docx
@@ -308,7 +308,7 @@
           <w:sz w:val="22"/>
           <w:szCs w:val="22"/>
         </w:rPr>
-        <w:t>5 - 10</w:t>
+        <w:t xml:space="preserve">5 </w:t>
       </w:r>
       <w:r>
         <w:rPr>
@@ -317,7 +317,7 @@
           <w:sz w:val="22"/>
           <w:szCs w:val="22"/>
         </w:rPr>
-        <w:t xml:space="preserve"> minutes</w:t>
+        <w:t>minutes</w:t>
       </w:r>
     </w:p>
     <w:p>
@@ -378,25 +378,7 @@
           <w:sz w:val="22"/>
           <w:szCs w:val="22"/>
         </w:rPr>
-        <w:t xml:space="preserve">To illustrate how bargaining can occur at any time, </w:t>
-      </w:r>
-      <w:proofErr w:type="gramStart"/>
-      <w:r>
-        <w:rPr>
-          <w:rFonts w:ascii="Arial" w:hAnsi="Arial" w:cs="Arial"/>
-          <w:sz w:val="22"/>
-          <w:szCs w:val="22"/>
-        </w:rPr>
-        <w:t>any place</w:t>
-      </w:r>
-      <w:proofErr w:type="gramEnd"/>
-      <w:r>
-        <w:rPr>
-          <w:rFonts w:ascii="Arial" w:hAnsi="Arial" w:cs="Arial"/>
-          <w:sz w:val="22"/>
-          <w:szCs w:val="22"/>
-        </w:rPr>
-        <w:t xml:space="preserve">.  </w:t>
+        <w:t xml:space="preserve">To illustrate how bargaining can occur at any time, any place.  </w:t>
       </w:r>
     </w:p>
     <w:p>
@@ -559,15 +541,23 @@
           <w:sz w:val="22"/>
           <w:szCs w:val="22"/>
         </w:rPr>
-        <w:t>5-10</w:t>
-      </w:r>
-      <w:r>
-        <w:rPr>
-          <w:rFonts w:ascii="Arial" w:hAnsi="Arial" w:cs="Arial"/>
-          <w:sz w:val="22"/>
-          <w:szCs w:val="22"/>
-        </w:rPr>
-        <w:t xml:space="preserve"> minutes</w:t>
+        <w:t>5</w:t>
+      </w:r>
+      <w:r>
+        <w:rPr>
+          <w:rFonts w:ascii="Arial" w:hAnsi="Arial" w:cs="Arial"/>
+          <w:sz w:val="22"/>
+          <w:szCs w:val="22"/>
+        </w:rPr>
+        <w:t xml:space="preserve"> </w:t>
+      </w:r>
+      <w:r>
+        <w:rPr>
+          <w:rFonts w:ascii="Arial" w:hAnsi="Arial" w:cs="Arial"/>
+          <w:sz w:val="22"/>
+          <w:szCs w:val="22"/>
+        </w:rPr>
+        <w:t>minutes</w:t>
       </w:r>
     </w:p>
     <w:p>

</xml_diff>